<commit_message>
Spring Integration Tests with H2
</commit_message>
<xml_diff>
--- a/SpringUnitTesting/TDDExample/RunningUnitTests.docx
+++ b/SpringUnitTesting/TDDExample/RunningUnitTests.docx
@@ -7,10 +7,16 @@
         <w:pStyle w:val="Normal"/>
         <w:bidi w:val="0"/>
         <w:jc w:val="start"/>
-        <w:rPr/>
-      </w:pPr>
-      <w:r>
-        <w:rPr/>
+        <w:rPr>
+          <w:b/>
+          <w:bCs/>
+        </w:rPr>
+      </w:pPr>
+      <w:r>
+        <w:rPr>
+          <w:b/>
+          <w:bCs/>
+        </w:rPr>
         <w:t>SpringBoot Service tests:</w:t>
       </w:r>
     </w:p>
@@ -19,6 +25,22 @@
         <w:pStyle w:val="Normal"/>
         <w:bidi w:val="0"/>
         <w:jc w:val="start"/>
+        <w:rPr>
+          <w:u w:val="single"/>
+        </w:rPr>
+      </w:pPr>
+      <w:r>
+        <w:rPr>
+          <w:u w:val="single"/>
+        </w:rPr>
+        <w:t>Unit tests</w:t>
+      </w:r>
+    </w:p>
+    <w:p>
+      <w:pPr>
+        <w:pStyle w:val="Normal"/>
+        <w:bidi w:val="0"/>
+        <w:jc w:val="start"/>
         <w:rPr/>
       </w:pPr>
       <w:r>
@@ -35,7 +57,11 @@
       </w:pPr>
       <w:r>
         <w:rPr/>
-        <w:t>Go to src/test/java</w:t>
+        <w:t xml:space="preserve">Go to src/test/java </w:t>
+      </w:r>
+      <w:r>
+        <w:rPr/>
+        <w:t>=&gt; create a package “service”</w:t>
       </w:r>
     </w:p>
     <w:p>
@@ -550,6 +576,1402 @@
         <w:rPr/>
       </w:r>
     </w:p>
+    <w:p>
+      <w:pPr>
+        <w:pStyle w:val="Normal"/>
+        <w:bidi w:val="0"/>
+        <w:jc w:val="start"/>
+        <w:rPr/>
+      </w:pPr>
+      <w:r>
+        <w:rPr/>
+      </w:r>
+    </w:p>
+    <w:p>
+      <w:pPr>
+        <w:pStyle w:val="Normal"/>
+        <w:bidi w:val="0"/>
+        <w:jc w:val="start"/>
+        <w:rPr/>
+      </w:pPr>
+      <w:r>
+        <w:rPr/>
+      </w:r>
+    </w:p>
+    <w:p>
+      <w:pPr>
+        <w:pStyle w:val="Normal"/>
+        <w:bidi w:val="0"/>
+        <w:jc w:val="start"/>
+        <w:rPr/>
+      </w:pPr>
+      <w:r>
+        <w:rPr/>
+      </w:r>
+    </w:p>
+    <w:p>
+      <w:pPr>
+        <w:pStyle w:val="Normal"/>
+        <w:bidi w:val="0"/>
+        <w:jc w:val="start"/>
+        <w:rPr/>
+      </w:pPr>
+      <w:r>
+        <w:rPr/>
+      </w:r>
+    </w:p>
+    <w:p>
+      <w:pPr>
+        <w:pStyle w:val="Normal"/>
+        <w:bidi w:val="0"/>
+        <w:jc w:val="start"/>
+        <w:rPr/>
+      </w:pPr>
+      <w:r>
+        <w:rPr/>
+      </w:r>
+    </w:p>
+    <w:p>
+      <w:pPr>
+        <w:pStyle w:val="Normal"/>
+        <w:bidi w:val="0"/>
+        <w:jc w:val="start"/>
+        <w:rPr/>
+      </w:pPr>
+      <w:r>
+        <w:rPr/>
+      </w:r>
+    </w:p>
+    <w:p>
+      <w:pPr>
+        <w:pStyle w:val="Normal"/>
+        <w:bidi w:val="0"/>
+        <w:jc w:val="start"/>
+        <w:rPr/>
+      </w:pPr>
+      <w:r>
+        <w:rPr/>
+      </w:r>
+    </w:p>
+    <w:p>
+      <w:pPr>
+        <w:pStyle w:val="Normal"/>
+        <w:bidi w:val="0"/>
+        <w:jc w:val="start"/>
+        <w:rPr>
+          <w:u w:val="single"/>
+        </w:rPr>
+      </w:pPr>
+      <w:r>
+        <w:rPr>
+          <w:u w:val="single"/>
+        </w:rPr>
+        <w:t>Integration tests:</w:t>
+      </w:r>
+    </w:p>
+    <w:p>
+      <w:pPr>
+        <w:pStyle w:val="Normal"/>
+        <w:bidi w:val="0"/>
+        <w:jc w:val="start"/>
+        <w:rPr/>
+      </w:pPr>
+      <w:r>
+        <w:rPr/>
+      </w:r>
+    </w:p>
+    <w:p>
+      <w:pPr>
+        <w:pStyle w:val="Normal"/>
+        <w:bidi w:val="0"/>
+        <w:jc w:val="start"/>
+        <w:rPr/>
+      </w:pPr>
+      <w:r>
+        <w:rPr/>
+        <w:t>Setup =&gt; go to src/test/java =&gt; create a new package “resources”. Copy the .sql files into this folder from /bin</w:t>
+      </w:r>
+    </w:p>
+    <w:p>
+      <w:pPr>
+        <w:pStyle w:val="Normal"/>
+        <w:bidi w:val="0"/>
+        <w:jc w:val="start"/>
+        <w:rPr/>
+      </w:pPr>
+      <w:r>
+        <w:rPr/>
+        <w:drawing>
+          <wp:anchor distT="0" distB="0" distL="0" distR="0" simplePos="0" relativeHeight="4" behindDoc="0" locked="0" layoutInCell="0" allowOverlap="1">
+            <wp:simplePos x="0" y="0"/>
+            <wp:positionH relativeFrom="column">
+              <wp:align>center</wp:align>
+            </wp:positionH>
+            <wp:positionV relativeFrom="paragraph">
+              <wp:posOffset>635</wp:posOffset>
+            </wp:positionV>
+            <wp:extent cx="3863340" cy="4161155"/>
+            <wp:effectExtent l="0" t="0" r="0" b="0"/>
+            <wp:wrapSquare wrapText="largest"/>
+            <wp:docPr id="3" name="Image3"/>
+            <wp:cNvGraphicFramePr>
+              <a:graphicFrameLocks xmlns:a="http://schemas.openxmlformats.org/drawingml/2006/main" noChangeAspect="1"/>
+            </wp:cNvGraphicFramePr>
+            <a:graphic xmlns:a="http://schemas.openxmlformats.org/drawingml/2006/main">
+              <a:graphicData uri="http://schemas.openxmlformats.org/drawingml/2006/picture">
+                <pic:pic xmlns:pic="http://schemas.openxmlformats.org/drawingml/2006/picture">
+                  <pic:nvPicPr>
+                    <pic:cNvPr id="3" name="Image3"/>
+                    <pic:cNvPicPr>
+                      <a:picLocks noChangeAspect="1" noChangeArrowheads="1"/>
+                    </pic:cNvPicPr>
+                  </pic:nvPicPr>
+                  <pic:blipFill>
+                    <a:blip r:embed="rId4"/>
+                    <a:stretch>
+                      <a:fillRect/>
+                    </a:stretch>
+                  </pic:blipFill>
+                  <pic:spPr bwMode="auto">
+                    <a:xfrm>
+                      <a:off x="0" y="0"/>
+                      <a:ext cx="3863340" cy="4161155"/>
+                    </a:xfrm>
+                    <a:prstGeom prst="rect">
+                      <a:avLst/>
+                    </a:prstGeom>
+                    <a:noFill/>
+                  </pic:spPr>
+                </pic:pic>
+              </a:graphicData>
+            </a:graphic>
+          </wp:anchor>
+        </w:drawing>
+      </w:r>
+    </w:p>
+    <w:p>
+      <w:pPr>
+        <w:pStyle w:val="Normal"/>
+        <w:bidi w:val="0"/>
+        <w:jc w:val="start"/>
+        <w:rPr/>
+      </w:pPr>
+      <w:r>
+        <w:rPr/>
+      </w:r>
+    </w:p>
+    <w:p>
+      <w:pPr>
+        <w:pStyle w:val="Normal"/>
+        <w:bidi w:val="0"/>
+        <w:jc w:val="start"/>
+        <w:rPr/>
+      </w:pPr>
+      <w:r>
+        <w:rPr/>
+      </w:r>
+    </w:p>
+    <w:p>
+      <w:pPr>
+        <w:pStyle w:val="Normal"/>
+        <w:bidi w:val="0"/>
+        <w:jc w:val="start"/>
+        <w:rPr/>
+      </w:pPr>
+      <w:r>
+        <w:rPr/>
+      </w:r>
+    </w:p>
+    <w:p>
+      <w:pPr>
+        <w:pStyle w:val="Normal"/>
+        <w:bidi w:val="0"/>
+        <w:jc w:val="start"/>
+        <w:rPr/>
+      </w:pPr>
+      <w:r>
+        <w:rPr/>
+      </w:r>
+    </w:p>
+    <w:p>
+      <w:pPr>
+        <w:pStyle w:val="Normal"/>
+        <w:bidi w:val="0"/>
+        <w:jc w:val="start"/>
+        <w:rPr/>
+      </w:pPr>
+      <w:r>
+        <w:rPr/>
+      </w:r>
+    </w:p>
+    <w:p>
+      <w:pPr>
+        <w:pStyle w:val="Normal"/>
+        <w:bidi w:val="0"/>
+        <w:jc w:val="start"/>
+        <w:rPr/>
+      </w:pPr>
+      <w:r>
+        <w:rPr/>
+      </w:r>
+    </w:p>
+    <w:p>
+      <w:pPr>
+        <w:pStyle w:val="Normal"/>
+        <w:bidi w:val="0"/>
+        <w:jc w:val="start"/>
+        <w:rPr/>
+      </w:pPr>
+      <w:r>
+        <w:rPr/>
+      </w:r>
+    </w:p>
+    <w:p>
+      <w:pPr>
+        <w:pStyle w:val="Normal"/>
+        <w:bidi w:val="0"/>
+        <w:jc w:val="start"/>
+        <w:rPr/>
+      </w:pPr>
+      <w:r>
+        <w:rPr/>
+      </w:r>
+    </w:p>
+    <w:p>
+      <w:pPr>
+        <w:pStyle w:val="Normal"/>
+        <w:bidi w:val="0"/>
+        <w:jc w:val="start"/>
+        <w:rPr/>
+      </w:pPr>
+      <w:r>
+        <w:rPr/>
+      </w:r>
+    </w:p>
+    <w:p>
+      <w:pPr>
+        <w:pStyle w:val="Normal"/>
+        <w:bidi w:val="0"/>
+        <w:jc w:val="start"/>
+        <w:rPr/>
+      </w:pPr>
+      <w:r>
+        <w:rPr/>
+      </w:r>
+    </w:p>
+    <w:p>
+      <w:pPr>
+        <w:pStyle w:val="Normal"/>
+        <w:bidi w:val="0"/>
+        <w:jc w:val="start"/>
+        <w:rPr/>
+      </w:pPr>
+      <w:r>
+        <w:rPr/>
+      </w:r>
+    </w:p>
+    <w:p>
+      <w:pPr>
+        <w:pStyle w:val="Normal"/>
+        <w:bidi w:val="0"/>
+        <w:jc w:val="start"/>
+        <w:rPr/>
+      </w:pPr>
+      <w:r>
+        <w:rPr/>
+      </w:r>
+    </w:p>
+    <w:p>
+      <w:pPr>
+        <w:pStyle w:val="Normal"/>
+        <w:bidi w:val="0"/>
+        <w:jc w:val="start"/>
+        <w:rPr/>
+      </w:pPr>
+      <w:r>
+        <w:rPr/>
+      </w:r>
+    </w:p>
+    <w:p>
+      <w:pPr>
+        <w:pStyle w:val="Normal"/>
+        <w:bidi w:val="0"/>
+        <w:jc w:val="start"/>
+        <w:rPr/>
+      </w:pPr>
+      <w:r>
+        <w:rPr/>
+      </w:r>
+    </w:p>
+    <w:p>
+      <w:pPr>
+        <w:pStyle w:val="Normal"/>
+        <w:bidi w:val="0"/>
+        <w:jc w:val="start"/>
+        <w:rPr/>
+      </w:pPr>
+      <w:r>
+        <w:rPr/>
+      </w:r>
+    </w:p>
+    <w:p>
+      <w:pPr>
+        <w:pStyle w:val="Normal"/>
+        <w:bidi w:val="0"/>
+        <w:jc w:val="start"/>
+        <w:rPr/>
+      </w:pPr>
+      <w:r>
+        <w:rPr/>
+      </w:r>
+    </w:p>
+    <w:p>
+      <w:pPr>
+        <w:pStyle w:val="Normal"/>
+        <w:bidi w:val="0"/>
+        <w:jc w:val="start"/>
+        <w:rPr/>
+      </w:pPr>
+      <w:r>
+        <w:rPr/>
+      </w:r>
+    </w:p>
+    <w:p>
+      <w:pPr>
+        <w:pStyle w:val="Normal"/>
+        <w:bidi w:val="0"/>
+        <w:jc w:val="start"/>
+        <w:rPr/>
+      </w:pPr>
+      <w:r>
+        <w:rPr/>
+      </w:r>
+    </w:p>
+    <w:p>
+      <w:pPr>
+        <w:pStyle w:val="Normal"/>
+        <w:bidi w:val="0"/>
+        <w:jc w:val="start"/>
+        <w:rPr/>
+      </w:pPr>
+      <w:r>
+        <w:rPr/>
+      </w:r>
+    </w:p>
+    <w:p>
+      <w:pPr>
+        <w:pStyle w:val="Normal"/>
+        <w:bidi w:val="0"/>
+        <w:jc w:val="start"/>
+        <w:rPr/>
+      </w:pPr>
+      <w:r>
+        <w:rPr/>
+      </w:r>
+    </w:p>
+    <w:p>
+      <w:pPr>
+        <w:pStyle w:val="Normal"/>
+        <w:bidi w:val="0"/>
+        <w:jc w:val="start"/>
+        <w:rPr/>
+      </w:pPr>
+      <w:r>
+        <w:rPr/>
+      </w:r>
+    </w:p>
+    <w:p>
+      <w:pPr>
+        <w:pStyle w:val="Normal"/>
+        <w:bidi w:val="0"/>
+        <w:jc w:val="start"/>
+        <w:rPr/>
+      </w:pPr>
+      <w:r>
+        <w:rPr/>
+      </w:r>
+    </w:p>
+    <w:p>
+      <w:pPr>
+        <w:pStyle w:val="Normal"/>
+        <w:bidi w:val="0"/>
+        <w:jc w:val="start"/>
+        <w:rPr/>
+      </w:pPr>
+      <w:r>
+        <w:rPr/>
+      </w:r>
+    </w:p>
+    <w:p>
+      <w:pPr>
+        <w:pStyle w:val="Normal"/>
+        <w:bidi w:val="0"/>
+        <w:jc w:val="start"/>
+        <w:rPr/>
+      </w:pPr>
+      <w:r>
+        <w:rPr/>
+      </w:r>
+    </w:p>
+    <w:p>
+      <w:pPr>
+        <w:pStyle w:val="Normal"/>
+        <w:bidi w:val="0"/>
+        <w:jc w:val="start"/>
+        <w:rPr/>
+      </w:pPr>
+      <w:r>
+        <w:rPr/>
+      </w:r>
+    </w:p>
+    <w:p>
+      <w:pPr>
+        <w:pStyle w:val="Normal"/>
+        <w:bidi w:val="0"/>
+        <w:jc w:val="start"/>
+        <w:rPr/>
+      </w:pPr>
+      <w:r>
+        <w:rPr/>
+        <w:t>Go to pom.xml and add a new dependency =&gt; note “scope” is “test”</w:t>
+      </w:r>
+    </w:p>
+    <w:p>
+      <w:pPr>
+        <w:pStyle w:val="Normal"/>
+        <w:bidi w:val="0"/>
+        <w:jc w:val="start"/>
+        <w:rPr/>
+      </w:pPr>
+      <w:r>
+        <w:rPr/>
+      </w:r>
+    </w:p>
+    <w:p>
+      <w:pPr>
+        <w:pStyle w:val="Normal"/>
+        <w:ind w:hanging="0"/>
+        <w:jc w:val="start"/>
+        <w:rPr>
+          <w:rFonts w:ascii="Consolas" w:hAnsi="Consolas"/>
+          <w:sz w:val="20"/>
+        </w:rPr>
+      </w:pPr>
+      <w:r>
+        <w:rPr>
+          <w:rFonts w:ascii="Consolas" w:hAnsi="Consolas"/>
+          <w:color w:val="D8D8D8"/>
+          <w:sz w:val="20"/>
+        </w:rPr>
+        <w:t xml:space="preserve">    </w:t>
+      </w:r>
+      <w:r>
+        <w:rPr>
+          <w:rFonts w:ascii="Consolas" w:hAnsi="Consolas"/>
+          <w:color w:val="D8D8D8"/>
+          <w:sz w:val="20"/>
+        </w:rPr>
+        <w:tab/>
+      </w:r>
+      <w:r>
+        <w:rPr>
+          <w:rFonts w:ascii="Consolas" w:hAnsi="Consolas"/>
+          <w:color w:val="808080"/>
+          <w:sz w:val="20"/>
+        </w:rPr>
+        <w:t>&lt;</w:t>
+      </w:r>
+      <w:r>
+        <w:rPr>
+          <w:rFonts w:ascii="Consolas" w:hAnsi="Consolas"/>
+          <w:color w:val="569CD6"/>
+          <w:sz w:val="20"/>
+        </w:rPr>
+        <w:t>dependency</w:t>
+      </w:r>
+      <w:r>
+        <w:rPr>
+          <w:rFonts w:ascii="Consolas" w:hAnsi="Consolas"/>
+          <w:color w:val="808080"/>
+          <w:sz w:val="20"/>
+        </w:rPr>
+        <w:t>&gt;</w:t>
+      </w:r>
+    </w:p>
+    <w:p>
+      <w:pPr>
+        <w:pStyle w:val="Normal"/>
+        <w:ind w:hanging="0"/>
+        <w:jc w:val="start"/>
+        <w:rPr>
+          <w:rFonts w:ascii="Consolas" w:hAnsi="Consolas"/>
+          <w:sz w:val="20"/>
+        </w:rPr>
+      </w:pPr>
+      <w:r>
+        <w:rPr>
+          <w:rFonts w:ascii="Consolas" w:hAnsi="Consolas"/>
+          <w:color w:val="D8D8D8"/>
+          <w:sz w:val="20"/>
+        </w:rPr>
+        <w:tab/>
+        <w:tab/>
+        <w:t xml:space="preserve">    </w:t>
+      </w:r>
+      <w:r>
+        <w:rPr>
+          <w:rFonts w:ascii="Consolas" w:hAnsi="Consolas"/>
+          <w:color w:val="808080"/>
+          <w:sz w:val="20"/>
+        </w:rPr>
+        <w:t>&lt;</w:t>
+      </w:r>
+      <w:r>
+        <w:rPr>
+          <w:rFonts w:ascii="Consolas" w:hAnsi="Consolas"/>
+          <w:color w:val="569CD6"/>
+          <w:sz w:val="20"/>
+        </w:rPr>
+        <w:t>groupId</w:t>
+      </w:r>
+      <w:r>
+        <w:rPr>
+          <w:rFonts w:ascii="Consolas" w:hAnsi="Consolas"/>
+          <w:color w:val="808080"/>
+          <w:sz w:val="20"/>
+        </w:rPr>
+        <w:t>&gt;</w:t>
+      </w:r>
+      <w:r>
+        <w:rPr>
+          <w:rFonts w:ascii="Consolas" w:hAnsi="Consolas"/>
+          <w:color w:val="D8D8D8"/>
+          <w:sz w:val="20"/>
+        </w:rPr>
+        <w:t>com.h2database</w:t>
+      </w:r>
+      <w:r>
+        <w:rPr>
+          <w:rFonts w:ascii="Consolas" w:hAnsi="Consolas"/>
+          <w:color w:val="808080"/>
+          <w:sz w:val="20"/>
+        </w:rPr>
+        <w:t>&lt;/</w:t>
+      </w:r>
+      <w:r>
+        <w:rPr>
+          <w:rFonts w:ascii="Consolas" w:hAnsi="Consolas"/>
+          <w:color w:val="569CD6"/>
+          <w:sz w:val="20"/>
+        </w:rPr>
+        <w:t>groupId</w:t>
+      </w:r>
+      <w:r>
+        <w:rPr>
+          <w:rFonts w:ascii="Consolas" w:hAnsi="Consolas"/>
+          <w:color w:val="808080"/>
+          <w:sz w:val="20"/>
+        </w:rPr>
+        <w:t>&gt;</w:t>
+      </w:r>
+    </w:p>
+    <w:p>
+      <w:pPr>
+        <w:pStyle w:val="Normal"/>
+        <w:ind w:hanging="0"/>
+        <w:jc w:val="start"/>
+        <w:rPr>
+          <w:rFonts w:ascii="Consolas" w:hAnsi="Consolas"/>
+          <w:sz w:val="20"/>
+        </w:rPr>
+      </w:pPr>
+      <w:r>
+        <w:rPr>
+          <w:rFonts w:ascii="Consolas" w:hAnsi="Consolas"/>
+          <w:color w:val="D8D8D8"/>
+          <w:sz w:val="20"/>
+        </w:rPr>
+        <w:tab/>
+        <w:tab/>
+        <w:t xml:space="preserve">    </w:t>
+      </w:r>
+      <w:r>
+        <w:rPr>
+          <w:rFonts w:ascii="Consolas" w:hAnsi="Consolas"/>
+          <w:color w:val="808080"/>
+          <w:sz w:val="20"/>
+        </w:rPr>
+        <w:t>&lt;</w:t>
+      </w:r>
+      <w:r>
+        <w:rPr>
+          <w:rFonts w:ascii="Consolas" w:hAnsi="Consolas"/>
+          <w:color w:val="569CD6"/>
+          <w:sz w:val="20"/>
+        </w:rPr>
+        <w:t>artifactId</w:t>
+      </w:r>
+      <w:r>
+        <w:rPr>
+          <w:rFonts w:ascii="Consolas" w:hAnsi="Consolas"/>
+          <w:color w:val="808080"/>
+          <w:sz w:val="20"/>
+        </w:rPr>
+        <w:t>&gt;</w:t>
+      </w:r>
+      <w:r>
+        <w:rPr>
+          <w:rFonts w:ascii="Consolas" w:hAnsi="Consolas"/>
+          <w:color w:val="D8D8D8"/>
+          <w:sz w:val="20"/>
+        </w:rPr>
+        <w:t>h2</w:t>
+      </w:r>
+      <w:r>
+        <w:rPr>
+          <w:rFonts w:ascii="Consolas" w:hAnsi="Consolas"/>
+          <w:color w:val="808080"/>
+          <w:sz w:val="20"/>
+        </w:rPr>
+        <w:t>&lt;/</w:t>
+      </w:r>
+      <w:r>
+        <w:rPr>
+          <w:rFonts w:ascii="Consolas" w:hAnsi="Consolas"/>
+          <w:color w:val="569CD6"/>
+          <w:sz w:val="20"/>
+        </w:rPr>
+        <w:t>artifactId</w:t>
+      </w:r>
+      <w:r>
+        <w:rPr>
+          <w:rFonts w:ascii="Consolas" w:hAnsi="Consolas"/>
+          <w:color w:val="808080"/>
+          <w:sz w:val="20"/>
+        </w:rPr>
+        <w:t>&gt;</w:t>
+      </w:r>
+    </w:p>
+    <w:p>
+      <w:pPr>
+        <w:pStyle w:val="Normal"/>
+        <w:ind w:hanging="0"/>
+        <w:jc w:val="start"/>
+        <w:rPr>
+          <w:rFonts w:ascii="Consolas" w:hAnsi="Consolas"/>
+          <w:sz w:val="20"/>
+        </w:rPr>
+      </w:pPr>
+      <w:r>
+        <w:rPr>
+          <w:rFonts w:ascii="Consolas" w:hAnsi="Consolas"/>
+          <w:color w:val="D8D8D8"/>
+          <w:sz w:val="20"/>
+        </w:rPr>
+        <w:tab/>
+        <w:tab/>
+        <w:t xml:space="preserve">    </w:t>
+      </w:r>
+      <w:r>
+        <w:rPr>
+          <w:rFonts w:ascii="Consolas" w:hAnsi="Consolas"/>
+          <w:color w:val="808080"/>
+          <w:sz w:val="20"/>
+        </w:rPr>
+        <w:t>&lt;</w:t>
+      </w:r>
+      <w:r>
+        <w:rPr>
+          <w:rFonts w:ascii="Consolas" w:hAnsi="Consolas"/>
+          <w:color w:val="569CD6"/>
+          <w:sz w:val="20"/>
+        </w:rPr>
+        <w:t>scope</w:t>
+      </w:r>
+      <w:r>
+        <w:rPr>
+          <w:rFonts w:ascii="Consolas" w:hAnsi="Consolas"/>
+          <w:color w:val="808080"/>
+          <w:sz w:val="20"/>
+        </w:rPr>
+        <w:t>&gt;</w:t>
+      </w:r>
+      <w:r>
+        <w:rPr>
+          <w:rFonts w:ascii="Consolas" w:hAnsi="Consolas"/>
+          <w:color w:val="D8D8D8"/>
+          <w:sz w:val="20"/>
+        </w:rPr>
+        <w:t>test</w:t>
+      </w:r>
+      <w:r>
+        <w:rPr>
+          <w:rFonts w:ascii="Consolas" w:hAnsi="Consolas"/>
+          <w:color w:val="808080"/>
+          <w:sz w:val="20"/>
+        </w:rPr>
+        <w:t>&lt;/</w:t>
+      </w:r>
+      <w:r>
+        <w:rPr>
+          <w:rFonts w:ascii="Consolas" w:hAnsi="Consolas"/>
+          <w:color w:val="569CD6"/>
+          <w:sz w:val="20"/>
+        </w:rPr>
+        <w:t>scope</w:t>
+      </w:r>
+      <w:r>
+        <w:rPr>
+          <w:rFonts w:ascii="Consolas" w:hAnsi="Consolas"/>
+          <w:color w:val="808080"/>
+          <w:sz w:val="20"/>
+        </w:rPr>
+        <w:t>&gt;</w:t>
+      </w:r>
+    </w:p>
+    <w:p>
+      <w:pPr>
+        <w:pStyle w:val="Normal"/>
+        <w:bidi w:val="0"/>
+        <w:jc w:val="start"/>
+        <w:rPr/>
+      </w:pPr>
+      <w:r>
+        <w:rPr>
+          <w:rFonts w:ascii="Consolas" w:hAnsi="Consolas"/>
+          <w:color w:val="D8D8D8"/>
+          <w:sz w:val="20"/>
+        </w:rPr>
+        <w:tab/>
+      </w:r>
+      <w:r>
+        <w:rPr>
+          <w:rFonts w:ascii="Consolas" w:hAnsi="Consolas"/>
+          <w:color w:val="808080"/>
+          <w:sz w:val="20"/>
+        </w:rPr>
+        <w:t>&lt;/</w:t>
+      </w:r>
+      <w:r>
+        <w:rPr>
+          <w:rFonts w:ascii="Consolas" w:hAnsi="Consolas"/>
+          <w:color w:val="569CD6"/>
+          <w:sz w:val="20"/>
+        </w:rPr>
+        <w:t>dependency</w:t>
+      </w:r>
+      <w:r>
+        <w:rPr>
+          <w:rFonts w:ascii="Consolas" w:hAnsi="Consolas"/>
+          <w:color w:val="808080"/>
+          <w:sz w:val="20"/>
+        </w:rPr>
+        <w:t>&gt;</w:t>
+      </w:r>
+    </w:p>
+    <w:p>
+      <w:pPr>
+        <w:pStyle w:val="Normal"/>
+        <w:bidi w:val="0"/>
+        <w:jc w:val="start"/>
+        <w:rPr/>
+      </w:pPr>
+      <w:r>
+        <w:rPr/>
+      </w:r>
+    </w:p>
+    <w:p>
+      <w:pPr>
+        <w:pStyle w:val="Normal"/>
+        <w:bidi w:val="0"/>
+        <w:jc w:val="start"/>
+        <w:rPr/>
+      </w:pPr>
+      <w:r>
+        <w:rPr/>
+        <w:drawing>
+          <wp:anchor distT="0" distB="0" distL="0" distR="0" simplePos="0" relativeHeight="5" behindDoc="0" locked="0" layoutInCell="0" allowOverlap="1">
+            <wp:simplePos x="0" y="0"/>
+            <wp:positionH relativeFrom="column">
+              <wp:align>center</wp:align>
+            </wp:positionH>
+            <wp:positionV relativeFrom="paragraph">
+              <wp:posOffset>635</wp:posOffset>
+            </wp:positionV>
+            <wp:extent cx="3238500" cy="1036320"/>
+            <wp:effectExtent l="0" t="0" r="0" b="0"/>
+            <wp:wrapSquare wrapText="largest"/>
+            <wp:docPr id="4" name="Image4"/>
+            <wp:cNvGraphicFramePr>
+              <a:graphicFrameLocks xmlns:a="http://schemas.openxmlformats.org/drawingml/2006/main" noChangeAspect="1"/>
+            </wp:cNvGraphicFramePr>
+            <a:graphic xmlns:a="http://schemas.openxmlformats.org/drawingml/2006/main">
+              <a:graphicData uri="http://schemas.openxmlformats.org/drawingml/2006/picture">
+                <pic:pic xmlns:pic="http://schemas.openxmlformats.org/drawingml/2006/picture">
+                  <pic:nvPicPr>
+                    <pic:cNvPr id="4" name="Image4"/>
+                    <pic:cNvPicPr>
+                      <a:picLocks noChangeAspect="1" noChangeArrowheads="1"/>
+                    </pic:cNvPicPr>
+                  </pic:nvPicPr>
+                  <pic:blipFill>
+                    <a:blip r:embed="rId5"/>
+                    <a:stretch>
+                      <a:fillRect/>
+                    </a:stretch>
+                  </pic:blipFill>
+                  <pic:spPr bwMode="auto">
+                    <a:xfrm>
+                      <a:off x="0" y="0"/>
+                      <a:ext cx="3238500" cy="1036320"/>
+                    </a:xfrm>
+                    <a:prstGeom prst="rect">
+                      <a:avLst/>
+                    </a:prstGeom>
+                    <a:noFill/>
+                  </pic:spPr>
+                </pic:pic>
+              </a:graphicData>
+            </a:graphic>
+          </wp:anchor>
+        </w:drawing>
+      </w:r>
+    </w:p>
+    <w:p>
+      <w:pPr>
+        <w:pStyle w:val="Normal"/>
+        <w:bidi w:val="0"/>
+        <w:jc w:val="start"/>
+        <w:rPr/>
+      </w:pPr>
+      <w:r>
+        <w:rPr/>
+      </w:r>
+    </w:p>
+    <w:p>
+      <w:pPr>
+        <w:pStyle w:val="Normal"/>
+        <w:bidi w:val="0"/>
+        <w:jc w:val="start"/>
+        <w:rPr/>
+      </w:pPr>
+      <w:r>
+        <w:rPr/>
+      </w:r>
+    </w:p>
+    <w:p>
+      <w:pPr>
+        <w:pStyle w:val="Normal"/>
+        <w:bidi w:val="0"/>
+        <w:jc w:val="start"/>
+        <w:rPr/>
+      </w:pPr>
+      <w:r>
+        <w:rPr/>
+      </w:r>
+    </w:p>
+    <w:p>
+      <w:pPr>
+        <w:pStyle w:val="Normal"/>
+        <w:bidi w:val="0"/>
+        <w:jc w:val="start"/>
+        <w:rPr/>
+      </w:pPr>
+      <w:r>
+        <w:rPr/>
+      </w:r>
+    </w:p>
+    <w:p>
+      <w:pPr>
+        <w:pStyle w:val="Normal"/>
+        <w:bidi w:val="0"/>
+        <w:jc w:val="start"/>
+        <w:rPr/>
+      </w:pPr>
+      <w:r>
+        <w:rPr/>
+      </w:r>
+    </w:p>
+    <w:p>
+      <w:pPr>
+        <w:pStyle w:val="Normal"/>
+        <w:bidi w:val="0"/>
+        <w:jc w:val="start"/>
+        <w:rPr/>
+      </w:pPr>
+      <w:r>
+        <w:rPr/>
+      </w:r>
+    </w:p>
+    <w:p>
+      <w:pPr>
+        <w:pStyle w:val="Normal"/>
+        <w:bidi w:val="0"/>
+        <w:jc w:val="start"/>
+        <w:rPr/>
+      </w:pPr>
+      <w:r>
+        <w:rPr/>
+        <w:t>Re-run the application</w:t>
+      </w:r>
+    </w:p>
+    <w:p>
+      <w:pPr>
+        <w:pStyle w:val="Normal"/>
+        <w:bidi w:val="0"/>
+        <w:jc w:val="start"/>
+        <w:rPr/>
+      </w:pPr>
+      <w:r>
+        <w:rPr/>
+      </w:r>
+    </w:p>
+    <w:p>
+      <w:pPr>
+        <w:pStyle w:val="Normal"/>
+        <w:bidi w:val="0"/>
+        <w:jc w:val="start"/>
+        <w:rPr/>
+      </w:pPr>
+      <w:r>
+        <w:rPr/>
+      </w:r>
+    </w:p>
+    <w:p>
+      <w:pPr>
+        <w:pStyle w:val="Normal"/>
+        <w:bidi w:val="0"/>
+        <w:jc w:val="start"/>
+        <w:rPr/>
+      </w:pPr>
+      <w:r>
+        <w:rPr/>
+      </w:r>
+    </w:p>
+    <w:p>
+      <w:pPr>
+        <w:pStyle w:val="Normal"/>
+        <w:bidi w:val="0"/>
+        <w:jc w:val="start"/>
+        <w:rPr/>
+      </w:pPr>
+      <w:r>
+        <w:rPr/>
+        <w:t>Create a new Java class =&gt; AccountServiceIntegrationTests.java</w:t>
+      </w:r>
+    </w:p>
+    <w:p>
+      <w:pPr>
+        <w:pStyle w:val="Normal"/>
+        <w:bidi w:val="0"/>
+        <w:jc w:val="start"/>
+        <w:rPr/>
+      </w:pPr>
+      <w:r>
+        <w:rPr/>
+      </w:r>
+    </w:p>
+    <w:p>
+      <w:pPr>
+        <w:pStyle w:val="Normal"/>
+        <w:bidi w:val="0"/>
+        <w:jc w:val="start"/>
+        <w:rPr/>
+      </w:pPr>
+      <w:r>
+        <w:rPr/>
+        <w:drawing>
+          <wp:anchor distT="0" distB="0" distL="0" distR="0" simplePos="0" relativeHeight="6" behindDoc="0" locked="0" layoutInCell="0" allowOverlap="1">
+            <wp:simplePos x="0" y="0"/>
+            <wp:positionH relativeFrom="column">
+              <wp:align>center</wp:align>
+            </wp:positionH>
+            <wp:positionV relativeFrom="paragraph">
+              <wp:posOffset>635</wp:posOffset>
+            </wp:positionV>
+            <wp:extent cx="2796540" cy="3329940"/>
+            <wp:effectExtent l="0" t="0" r="0" b="0"/>
+            <wp:wrapSquare wrapText="largest"/>
+            <wp:docPr id="5" name="Image5"/>
+            <wp:cNvGraphicFramePr>
+              <a:graphicFrameLocks xmlns:a="http://schemas.openxmlformats.org/drawingml/2006/main" noChangeAspect="1"/>
+            </wp:cNvGraphicFramePr>
+            <a:graphic xmlns:a="http://schemas.openxmlformats.org/drawingml/2006/main">
+              <a:graphicData uri="http://schemas.openxmlformats.org/drawingml/2006/picture">
+                <pic:pic xmlns:pic="http://schemas.openxmlformats.org/drawingml/2006/picture">
+                  <pic:nvPicPr>
+                    <pic:cNvPr id="5" name="Image5"/>
+                    <pic:cNvPicPr>
+                      <a:picLocks noChangeAspect="1" noChangeArrowheads="1"/>
+                    </pic:cNvPicPr>
+                  </pic:nvPicPr>
+                  <pic:blipFill>
+                    <a:blip r:embed="rId6"/>
+                    <a:stretch>
+                      <a:fillRect/>
+                    </a:stretch>
+                  </pic:blipFill>
+                  <pic:spPr bwMode="auto">
+                    <a:xfrm>
+                      <a:off x="0" y="0"/>
+                      <a:ext cx="2796540" cy="3329940"/>
+                    </a:xfrm>
+                    <a:prstGeom prst="rect">
+                      <a:avLst/>
+                    </a:prstGeom>
+                    <a:noFill/>
+                  </pic:spPr>
+                </pic:pic>
+              </a:graphicData>
+            </a:graphic>
+          </wp:anchor>
+        </w:drawing>
+      </w:r>
+    </w:p>
+    <w:p>
+      <w:pPr>
+        <w:pStyle w:val="Normal"/>
+        <w:bidi w:val="0"/>
+        <w:jc w:val="start"/>
+        <w:rPr/>
+      </w:pPr>
+      <w:r>
+        <w:rPr/>
+      </w:r>
+    </w:p>
+    <w:p>
+      <w:pPr>
+        <w:pStyle w:val="Normal"/>
+        <w:bidi w:val="0"/>
+        <w:jc w:val="start"/>
+        <w:rPr/>
+      </w:pPr>
+      <w:r>
+        <w:rPr/>
+      </w:r>
+    </w:p>
+    <w:p>
+      <w:pPr>
+        <w:pStyle w:val="Normal"/>
+        <w:bidi w:val="0"/>
+        <w:jc w:val="start"/>
+        <w:rPr/>
+      </w:pPr>
+      <w:r>
+        <w:rPr/>
+      </w:r>
+    </w:p>
+    <w:p>
+      <w:pPr>
+        <w:pStyle w:val="Normal"/>
+        <w:bidi w:val="0"/>
+        <w:jc w:val="start"/>
+        <w:rPr/>
+      </w:pPr>
+      <w:r>
+        <w:rPr/>
+      </w:r>
+    </w:p>
+    <w:p>
+      <w:pPr>
+        <w:pStyle w:val="Normal"/>
+        <w:bidi w:val="0"/>
+        <w:jc w:val="start"/>
+        <w:rPr/>
+      </w:pPr>
+      <w:r>
+        <w:rPr/>
+      </w:r>
+    </w:p>
+    <w:p>
+      <w:pPr>
+        <w:pStyle w:val="Normal"/>
+        <w:bidi w:val="0"/>
+        <w:jc w:val="start"/>
+        <w:rPr/>
+      </w:pPr>
+      <w:r>
+        <w:rPr/>
+      </w:r>
+    </w:p>
+    <w:p>
+      <w:pPr>
+        <w:pStyle w:val="Normal"/>
+        <w:bidi w:val="0"/>
+        <w:jc w:val="start"/>
+        <w:rPr/>
+      </w:pPr>
+      <w:r>
+        <w:rPr/>
+      </w:r>
+    </w:p>
+    <w:p>
+      <w:pPr>
+        <w:pStyle w:val="Normal"/>
+        <w:bidi w:val="0"/>
+        <w:jc w:val="start"/>
+        <w:rPr/>
+      </w:pPr>
+      <w:r>
+        <w:rPr/>
+      </w:r>
+    </w:p>
+    <w:p>
+      <w:pPr>
+        <w:pStyle w:val="Normal"/>
+        <w:bidi w:val="0"/>
+        <w:jc w:val="start"/>
+        <w:rPr/>
+      </w:pPr>
+      <w:r>
+        <w:rPr/>
+      </w:r>
+    </w:p>
+    <w:p>
+      <w:pPr>
+        <w:pStyle w:val="Normal"/>
+        <w:bidi w:val="0"/>
+        <w:jc w:val="start"/>
+        <w:rPr/>
+      </w:pPr>
+      <w:r>
+        <w:rPr/>
+      </w:r>
+    </w:p>
+    <w:p>
+      <w:pPr>
+        <w:pStyle w:val="Normal"/>
+        <w:bidi w:val="0"/>
+        <w:jc w:val="start"/>
+        <w:rPr/>
+      </w:pPr>
+      <w:r>
+        <w:rPr/>
+      </w:r>
+    </w:p>
+    <w:p>
+      <w:pPr>
+        <w:pStyle w:val="Normal"/>
+        <w:bidi w:val="0"/>
+        <w:jc w:val="start"/>
+        <w:rPr/>
+      </w:pPr>
+      <w:r>
+        <w:rPr/>
+      </w:r>
+    </w:p>
+    <w:p>
+      <w:pPr>
+        <w:pStyle w:val="Normal"/>
+        <w:bidi w:val="0"/>
+        <w:jc w:val="start"/>
+        <w:rPr/>
+      </w:pPr>
+      <w:r>
+        <w:rPr/>
+      </w:r>
+    </w:p>
+    <w:p>
+      <w:pPr>
+        <w:pStyle w:val="Normal"/>
+        <w:bidi w:val="0"/>
+        <w:jc w:val="start"/>
+        <w:rPr/>
+      </w:pPr>
+      <w:r>
+        <w:rPr/>
+      </w:r>
+    </w:p>
+    <w:p>
+      <w:pPr>
+        <w:pStyle w:val="Normal"/>
+        <w:bidi w:val="0"/>
+        <w:jc w:val="start"/>
+        <w:rPr/>
+      </w:pPr>
+      <w:r>
+        <w:rPr/>
+      </w:r>
+    </w:p>
+    <w:p>
+      <w:pPr>
+        <w:pStyle w:val="Normal"/>
+        <w:bidi w:val="0"/>
+        <w:jc w:val="start"/>
+        <w:rPr/>
+      </w:pPr>
+      <w:r>
+        <w:rPr/>
+      </w:r>
+    </w:p>
+    <w:p>
+      <w:pPr>
+        <w:pStyle w:val="Normal"/>
+        <w:bidi w:val="0"/>
+        <w:jc w:val="start"/>
+        <w:rPr/>
+      </w:pPr>
+      <w:r>
+        <w:rPr/>
+      </w:r>
+    </w:p>
+    <w:p>
+      <w:pPr>
+        <w:pStyle w:val="Normal"/>
+        <w:bidi w:val="0"/>
+        <w:jc w:val="start"/>
+        <w:rPr/>
+      </w:pPr>
+      <w:r>
+        <w:rPr/>
+      </w:r>
+    </w:p>
+    <w:p>
+      <w:pPr>
+        <w:pStyle w:val="Normal"/>
+        <w:bidi w:val="0"/>
+        <w:jc w:val="start"/>
+        <w:rPr/>
+      </w:pPr>
+      <w:r>
+        <w:rPr/>
+      </w:r>
+    </w:p>
+    <w:p>
+      <w:pPr>
+        <w:pStyle w:val="Normal"/>
+        <w:bidi w:val="0"/>
+        <w:jc w:val="start"/>
+        <w:rPr/>
+      </w:pPr>
+      <w:r>
+        <w:rPr/>
+      </w:r>
+    </w:p>
+    <w:p>
+      <w:pPr>
+        <w:pStyle w:val="Normal"/>
+        <w:bidi w:val="0"/>
+        <w:jc w:val="start"/>
+        <w:rPr/>
+      </w:pPr>
+      <w:r>
+        <w:rPr/>
+        <w:t>required for SpringBoot tests</w:t>
+      </w:r>
+    </w:p>
+    <w:p>
+      <w:pPr>
+        <w:pStyle w:val="Normal"/>
+        <w:bidi w:val="0"/>
+        <w:jc w:val="start"/>
+        <w:rPr/>
+      </w:pPr>
+      <w:r>
+        <w:rPr/>
+        <w:t>@SpringBootTest</w:t>
+      </w:r>
+    </w:p>
+    <w:p>
+      <w:pPr>
+        <w:pStyle w:val="Normal"/>
+        <w:bidi w:val="0"/>
+        <w:jc w:val="start"/>
+        <w:rPr/>
+      </w:pPr>
+      <w:r>
+        <w:rPr/>
+        <w:t>@AutoConfigureTestDatabase(replace=Replace.ANY)</w:t>
+      </w:r>
+    </w:p>
+    <w:p>
+      <w:pPr>
+        <w:pStyle w:val="Normal"/>
+        <w:bidi w:val="0"/>
+        <w:jc w:val="start"/>
+        <w:rPr/>
+      </w:pPr>
+      <w:r>
+        <w:rPr/>
+      </w:r>
+    </w:p>
+    <w:p>
+      <w:pPr>
+        <w:pStyle w:val="Normal"/>
+        <w:bidi w:val="0"/>
+        <w:jc w:val="start"/>
+        <w:rPr/>
+      </w:pPr>
+      <w:r>
+        <w:rPr/>
+      </w:r>
+    </w:p>
+    <w:p>
+      <w:pPr>
+        <w:pStyle w:val="Normal"/>
+        <w:bidi w:val="0"/>
+        <w:jc w:val="start"/>
+        <w:rPr/>
+      </w:pPr>
+      <w:r>
+        <w:rPr/>
+      </w:r>
+    </w:p>
+    <w:p>
+      <w:pPr>
+        <w:pStyle w:val="Normal"/>
+        <w:bidi w:val="0"/>
+        <w:jc w:val="start"/>
+        <w:rPr/>
+      </w:pPr>
+      <w:r>
+        <w:rPr/>
+      </w:r>
+    </w:p>
+    <w:p>
+      <w:pPr>
+        <w:pStyle w:val="Normal"/>
+        <w:bidi w:val="0"/>
+        <w:jc w:val="start"/>
+        <w:rPr/>
+      </w:pPr>
+      <w:r>
+        <w:rPr/>
+      </w:r>
+    </w:p>
+    <w:p>
+      <w:pPr>
+        <w:pStyle w:val="Normal"/>
+        <w:bidi w:val="0"/>
+        <w:jc w:val="start"/>
+        <w:rPr/>
+      </w:pPr>
+      <w:r>
+        <w:rPr/>
+      </w:r>
+    </w:p>
+    <w:p>
+      <w:pPr>
+        <w:pStyle w:val="Normal"/>
+        <w:bidi w:val="0"/>
+        <w:jc w:val="start"/>
+        <w:rPr/>
+      </w:pPr>
+      <w:r>
+        <w:rPr/>
+      </w:r>
+    </w:p>
+    <w:p>
+      <w:pPr>
+        <w:pStyle w:val="Normal"/>
+        <w:bidi w:val="0"/>
+        <w:jc w:val="start"/>
+        <w:rPr/>
+      </w:pPr>
+      <w:r>
+        <w:rPr/>
+      </w:r>
+    </w:p>
     <w:sectPr>
       <w:type w:val="nextPage"/>
       <w:pgSz w:w="12240" w:h="15840"/>
@@ -557,6 +1979,7 @@
       <w:pgNumType w:fmt="decimal"/>
       <w:formProt w:val="false"/>
       <w:textDirection w:val="lrTb"/>
+      <w:docGrid w:type="default" w:linePitch="100" w:charSpace="0"/>
     </w:sectPr>
   </w:body>
 </w:document>
@@ -576,7 +1999,6 @@
     </w:rPrDefault>
     <w:pPrDefault>
       <w:pPr>
-        <w:widowControl/>
         <w:suppressAutoHyphens w:val="true"/>
       </w:pPr>
     </w:pPrDefault>
@@ -586,7 +2008,10 @@
     <w:qFormat/>
     <w:pPr>
       <w:widowControl/>
+      <w:suppressAutoHyphens w:val="true"/>
       <w:bidi w:val="0"/>
+      <w:spacing w:before="0" w:after="0"/>
+      <w:jc w:val="start"/>
     </w:pPr>
     <w:rPr>
       <w:rFonts w:ascii="Liberation Serif" w:hAnsi="Liberation Serif" w:eastAsia="NSimSun" w:cs="Lucida Sans"/>

</xml_diff>